<commit_message>
chore(ag): improve layout of PDF templates
</commit_message>
<xml_diff>
--- a/document-merge-service/kt_ag/templatefiles/eingabequittung.docx
+++ b/document-merge-service/kt_ag/templatefiles/eingabequittung.docx
@@ -6,18 +6,10 @@
       <w:pPr>
         <w:pStyle w:val="Title"/>
         <w:spacing w:before="2160" w:after="288"/>
-        <w:rPr/>
-      </w:pPr>
-      <w:r>
-        <w:rPr/>
-      </w:r>
-    </w:p>
-    <w:p>
-      <w:pPr>
-        <w:pStyle w:val="Title"/>
-        <w:spacing w:before="2160" w:after="288"/>
         <w:jc w:val="left"/>
-        <w:rPr/>
+        <w:rPr>
+          <w:rFonts w:ascii="Arial" w:hAnsi="Arial"/>
+        </w:rPr>
       </w:pPr>
       <w:r>
         <w:rPr/>
@@ -27,7 +19,9 @@
     <w:p>
       <w:pPr>
         <w:pStyle w:val="Subtitle"/>
-        <w:rPr/>
+        <w:rPr>
+          <w:rFonts w:ascii="Arial" w:hAnsi="Arial"/>
+        </w:rPr>
       </w:pPr>
       <w:r>
         <w:rPr/>
@@ -68,17 +62,10 @@
               <w:widowControl w:val="false"/>
               <w:numPr>
                 <w:ilvl w:val="2"/>
-                <w:numId w:val="4"/>
+                <w:numId w:val="5"/>
               </w:numPr>
               <w:rPr>
-                <w:b w:val="false"/>
-                <w:b w:val="false"/>
-                <w:bCs w:val="false"/>
-                <w:i w:val="false"/>
-                <w:i w:val="false"/>
-                <w:iCs w:val="false"/>
-                <w:sz w:val="24"/>
-                <w:szCs w:val="24"/>
+                <w:rFonts w:ascii="Arial" w:hAnsi="Arial"/>
               </w:rPr>
             </w:pPr>
             <w:r>
@@ -102,17 +89,10 @@
               <w:widowControl w:val="false"/>
               <w:numPr>
                 <w:ilvl w:val="2"/>
-                <w:numId w:val="4"/>
+                <w:numId w:val="5"/>
               </w:numPr>
               <w:rPr>
-                <w:b w:val="false"/>
-                <w:b w:val="false"/>
-                <w:bCs w:val="false"/>
-                <w:i w:val="false"/>
-                <w:i w:val="false"/>
-                <w:iCs w:val="false"/>
-                <w:sz w:val="24"/>
-                <w:szCs w:val="24"/>
+                <w:rFonts w:ascii="Arial" w:hAnsi="Arial"/>
               </w:rPr>
             </w:pPr>
             <w:r>
@@ -134,15 +114,7 @@
               <w:pStyle w:val="TableContents"/>
               <w:widowControl w:val="false"/>
               <w:rPr>
-                <w:rFonts w:ascii="Liberation Sans" w:hAnsi="Liberation Sans" w:eastAsia="Noto Sans CJK SC Regular" w:cs="Arial"/>
-                <w:b w:val="false"/>
-                <w:b w:val="false"/>
-                <w:bCs w:val="false"/>
-                <w:color w:val="auto"/>
-                <w:kern w:val="2"/>
-                <w:sz w:val="18"/>
-                <w:szCs w:val="18"/>
-                <w:lang w:val="fr-CH" w:eastAsia="zh-CN" w:bidi="hi-IN"/>
+                <w:rFonts w:ascii="Arial" w:hAnsi="Arial"/>
               </w:rPr>
             </w:pPr>
             <w:r>
@@ -165,15 +137,7 @@
               <w:pStyle w:val="TableContents"/>
               <w:widowControl w:val="false"/>
               <w:rPr>
-                <w:rFonts w:ascii="Liberation Sans" w:hAnsi="Liberation Sans" w:eastAsia="Noto Sans CJK SC Regular" w:cs="Arial"/>
-                <w:b w:val="false"/>
-                <w:b w:val="false"/>
-                <w:bCs w:val="false"/>
-                <w:color w:val="auto"/>
-                <w:kern w:val="2"/>
-                <w:sz w:val="18"/>
-                <w:szCs w:val="18"/>
-                <w:lang w:val="fr-CH" w:eastAsia="zh-CN" w:bidi="hi-IN"/>
+                <w:rFonts w:ascii="Arial" w:hAnsi="Arial"/>
               </w:rPr>
             </w:pPr>
             <w:r>
@@ -186,15 +150,7 @@
               <w:pStyle w:val="TableContents"/>
               <w:widowControl w:val="false"/>
               <w:rPr>
-                <w:rFonts w:ascii="Liberation Sans" w:hAnsi="Liberation Sans" w:eastAsia="Noto Sans CJK SC Regular" w:cs="Arial"/>
-                <w:b w:val="false"/>
-                <w:b w:val="false"/>
-                <w:bCs w:val="false"/>
-                <w:color w:val="auto"/>
-                <w:kern w:val="2"/>
-                <w:sz w:val="18"/>
-                <w:szCs w:val="18"/>
-                <w:lang w:val="fr-CH" w:eastAsia="zh-CN" w:bidi="hi-IN"/>
+                <w:rFonts w:ascii="Arial" w:hAnsi="Arial"/>
               </w:rPr>
             </w:pPr>
             <w:r>
@@ -217,17 +173,10 @@
               <w:widowControl w:val="false"/>
               <w:numPr>
                 <w:ilvl w:val="3"/>
-                <w:numId w:val="4"/>
+                <w:numId w:val="5"/>
               </w:numPr>
               <w:rPr>
-                <w:b w:val="false"/>
-                <w:b w:val="false"/>
-                <w:bCs w:val="false"/>
-                <w:i w:val="false"/>
-                <w:i w:val="false"/>
-                <w:iCs w:val="false"/>
-                <w:sz w:val="24"/>
-                <w:szCs w:val="24"/>
+                <w:rFonts w:ascii="Arial" w:hAnsi="Arial"/>
               </w:rPr>
             </w:pPr>
             <w:r>
@@ -251,18 +200,10 @@
               <w:widowControl w:val="false"/>
               <w:numPr>
                 <w:ilvl w:val="3"/>
-                <w:numId w:val="4"/>
+                <w:numId w:val="5"/>
               </w:numPr>
               <w:rPr>
-                <w:rFonts w:ascii="Liberation Sans" w:hAnsi="Liberation Sans" w:eastAsia="Noto Sans CJK SC Regular" w:cs="Arial"/>
-                <w:b/>
-                <w:b/>
-                <w:bCs/>
-                <w:color w:val="auto"/>
-                <w:kern w:val="2"/>
-                <w:sz w:val="18"/>
-                <w:szCs w:val="18"/>
-                <w:lang w:val="fr-CH" w:eastAsia="zh-CN" w:bidi="hi-IN"/>
+                <w:rFonts w:ascii="Arial" w:hAnsi="Arial"/>
               </w:rPr>
             </w:pPr>
             <w:r>
@@ -285,12 +226,10 @@
               <w:widowControl w:val="false"/>
               <w:numPr>
                 <w:ilvl w:val="3"/>
-                <w:numId w:val="4"/>
+                <w:numId w:val="5"/>
               </w:numPr>
               <w:rPr>
-                <w:b w:val="false"/>
-                <w:b w:val="false"/>
-                <w:bCs w:val="false"/>
+                <w:rFonts w:ascii="Arial" w:hAnsi="Arial"/>
               </w:rPr>
             </w:pPr>
             <w:r>
@@ -328,18 +267,10 @@
               <w:widowControl w:val="false"/>
               <w:numPr>
                 <w:ilvl w:val="3"/>
-                <w:numId w:val="4"/>
+                <w:numId w:val="5"/>
               </w:numPr>
               <w:rPr>
-                <w:rFonts w:ascii="Liberation Sans" w:hAnsi="Liberation Sans" w:eastAsia="Noto Sans CJK SC Regular" w:cs="Arial"/>
-                <w:b w:val="false"/>
-                <w:b w:val="false"/>
-                <w:bCs w:val="false"/>
-                <w:color w:val="auto"/>
-                <w:kern w:val="2"/>
-                <w:sz w:val="18"/>
-                <w:szCs w:val="18"/>
-                <w:lang w:val="fr-CH" w:eastAsia="zh-CN" w:bidi="hi-IN"/>
+                <w:rFonts w:ascii="Arial" w:hAnsi="Arial"/>
               </w:rPr>
             </w:pPr>
             <w:r>
@@ -355,18 +286,10 @@
               <w:widowControl w:val="false"/>
               <w:numPr>
                 <w:ilvl w:val="3"/>
-                <w:numId w:val="4"/>
+                <w:numId w:val="5"/>
               </w:numPr>
               <w:rPr>
-                <w:rFonts w:ascii="Liberation Sans" w:hAnsi="Liberation Sans" w:eastAsia="Noto Sans CJK SC Regular" w:cs="Arial"/>
-                <w:b w:val="false"/>
-                <w:b w:val="false"/>
-                <w:bCs w:val="false"/>
-                <w:color w:val="auto"/>
-                <w:kern w:val="2"/>
-                <w:sz w:val="18"/>
-                <w:szCs w:val="18"/>
-                <w:lang w:val="fr-CH" w:eastAsia="zh-CN" w:bidi="hi-IN"/>
+                <w:rFonts w:ascii="Arial" w:hAnsi="Arial"/>
               </w:rPr>
             </w:pPr>
             <w:r>
@@ -391,17 +314,10 @@
               <w:widowControl w:val="false"/>
               <w:numPr>
                 <w:ilvl w:val="2"/>
-                <w:numId w:val="4"/>
+                <w:numId w:val="5"/>
               </w:numPr>
               <w:rPr>
-                <w:b w:val="false"/>
-                <w:b w:val="false"/>
-                <w:bCs w:val="false"/>
-                <w:i w:val="false"/>
-                <w:i w:val="false"/>
-                <w:iCs w:val="false"/>
-                <w:sz w:val="24"/>
-                <w:szCs w:val="24"/>
+                <w:rFonts w:ascii="Arial" w:hAnsi="Arial"/>
               </w:rPr>
             </w:pPr>
             <w:r>
@@ -425,18 +341,10 @@
               <w:widowControl w:val="false"/>
               <w:numPr>
                 <w:ilvl w:val="2"/>
-                <w:numId w:val="4"/>
+                <w:numId w:val="5"/>
               </w:numPr>
               <w:rPr>
-                <w:rFonts w:ascii="Liberation Sans" w:hAnsi="Liberation Sans" w:eastAsia="Noto Sans CJK SC Regular" w:cs="Arial"/>
-                <w:b/>
-                <w:b/>
-                <w:bCs/>
-                <w:color w:val="auto"/>
-                <w:kern w:val="2"/>
-                <w:sz w:val="18"/>
-                <w:szCs w:val="18"/>
-                <w:lang w:val="fr-CH" w:eastAsia="zh-CN" w:bidi="hi-IN"/>
+                <w:rFonts w:ascii="Arial" w:hAnsi="Arial"/>
               </w:rPr>
             </w:pPr>
             <w:r>
@@ -459,18 +367,10 @@
               <w:widowControl w:val="false"/>
               <w:numPr>
                 <w:ilvl w:val="2"/>
-                <w:numId w:val="4"/>
+                <w:numId w:val="5"/>
               </w:numPr>
               <w:rPr>
-                <w:rFonts w:ascii="Liberation Sans" w:hAnsi="Liberation Sans" w:eastAsia="Noto Sans CJK SC Regular" w:cs="Arial"/>
-                <w:b w:val="false"/>
-                <w:b w:val="false"/>
-                <w:bCs w:val="false"/>
-                <w:color w:val="auto"/>
-                <w:kern w:val="2"/>
-                <w:sz w:val="18"/>
-                <w:szCs w:val="18"/>
-                <w:lang w:val="fr-CH" w:eastAsia="zh-CN" w:bidi="hi-IN"/>
+                <w:rFonts w:ascii="Arial" w:hAnsi="Arial"/>
               </w:rPr>
             </w:pPr>
             <w:r>
@@ -494,18 +394,10 @@
               <w:widowControl w:val="false"/>
               <w:numPr>
                 <w:ilvl w:val="3"/>
-                <w:numId w:val="4"/>
+                <w:numId w:val="5"/>
               </w:numPr>
               <w:rPr>
-                <w:rFonts w:ascii="Liberation Sans" w:hAnsi="Liberation Sans" w:eastAsia="Noto Sans CJK SC Regular" w:cs="Arial"/>
-                <w:b w:val="false"/>
-                <w:b w:val="false"/>
-                <w:bCs w:val="false"/>
-                <w:color w:val="auto"/>
-                <w:kern w:val="2"/>
-                <w:sz w:val="18"/>
-                <w:szCs w:val="18"/>
-                <w:lang w:val="fr-CH" w:eastAsia="zh-CN" w:bidi="hi-IN"/>
+                <w:rFonts w:ascii="Arial" w:hAnsi="Arial"/>
               </w:rPr>
             </w:pPr>
             <w:r>
@@ -519,18 +411,10 @@
               <w:widowControl w:val="false"/>
               <w:numPr>
                 <w:ilvl w:val="3"/>
-                <w:numId w:val="4"/>
+                <w:numId w:val="5"/>
               </w:numPr>
               <w:rPr>
-                <w:rFonts w:ascii="Liberation Sans" w:hAnsi="Liberation Sans" w:eastAsia="Noto Sans CJK SC Regular" w:cs="Arial"/>
-                <w:b w:val="false"/>
-                <w:b w:val="false"/>
-                <w:bCs w:val="false"/>
-                <w:color w:val="auto"/>
-                <w:kern w:val="2"/>
-                <w:sz w:val="18"/>
-                <w:szCs w:val="18"/>
-                <w:lang w:val="fr-CH" w:eastAsia="zh-CN" w:bidi="hi-IN"/>
+                <w:rFonts w:ascii="Arial" w:hAnsi="Arial"/>
               </w:rPr>
             </w:pPr>
             <w:r>
@@ -553,18 +437,10 @@
               <w:widowControl w:val="false"/>
               <w:numPr>
                 <w:ilvl w:val="2"/>
-                <w:numId w:val="4"/>
+                <w:numId w:val="5"/>
               </w:numPr>
               <w:rPr>
-                <w:rFonts w:ascii="Liberation Sans" w:hAnsi="Liberation Sans" w:eastAsia="Noto Sans CJK SC Regular" w:cs="Arial"/>
-                <w:b/>
-                <w:b/>
-                <w:bCs/>
-                <w:color w:val="auto"/>
-                <w:kern w:val="2"/>
-                <w:sz w:val="18"/>
-                <w:szCs w:val="18"/>
-                <w:lang w:val="fr-CH" w:eastAsia="zh-CN" w:bidi="hi-IN"/>
+                <w:rFonts w:ascii="Arial" w:hAnsi="Arial"/>
               </w:rPr>
             </w:pPr>
             <w:r>
@@ -588,11 +464,10 @@
               <w:widowControl w:val="false"/>
               <w:numPr>
                 <w:ilvl w:val="2"/>
-                <w:numId w:val="4"/>
+                <w:numId w:val="5"/>
               </w:numPr>
               <w:rPr>
-                <w:rFonts w:ascii="Liberation Sans" w:hAnsi="Liberation Sans" w:eastAsia="Noto Sans CJK SC Regular" w:cs="Arial"/>
-                <w:b/>
+                <w:rFonts w:ascii="Arial" w:hAnsi="Arial" w:eastAsia="Noto Sans CJK SC Regular" w:cs="Arial"/>
                 <w:b/>
                 <w:bCs/>
                 <w:color w:val="auto"/>
@@ -604,7 +479,7 @@
             </w:pPr>
             <w:r>
               <w:rPr>
-                <w:rFonts w:eastAsia="Noto Sans CJK SC Regular" w:cs="Arial" w:ascii="Liberation Sans" w:hAnsi="Liberation Sans"/>
+                <w:rFonts w:eastAsia="Noto Sans CJK SC Regular" w:cs="Arial"/>
                 <w:b/>
                 <w:bCs/>
                 <w:color w:val="auto"/>
@@ -630,18 +505,10 @@
               <w:widowControl w:val="false"/>
               <w:numPr>
                 <w:ilvl w:val="3"/>
-                <w:numId w:val="4"/>
+                <w:numId w:val="5"/>
               </w:numPr>
               <w:rPr>
-                <w:rFonts w:ascii="Liberation Sans" w:hAnsi="Liberation Sans" w:eastAsia="Noto Sans CJK SC Regular" w:cs="Arial"/>
-                <w:b w:val="false"/>
-                <w:b w:val="false"/>
-                <w:bCs w:val="false"/>
-                <w:color w:val="auto"/>
-                <w:kern w:val="2"/>
-                <w:sz w:val="18"/>
-                <w:szCs w:val="18"/>
-                <w:lang w:val="fr-CH" w:eastAsia="zh-CN" w:bidi="hi-IN"/>
+                <w:rFonts w:ascii="Arial" w:hAnsi="Arial"/>
               </w:rPr>
             </w:pPr>
             <w:r>
@@ -665,11 +532,10 @@
               <w:widowControl w:val="false"/>
               <w:numPr>
                 <w:ilvl w:val="3"/>
-                <w:numId w:val="4"/>
+                <w:numId w:val="5"/>
               </w:numPr>
               <w:rPr>
-                <w:rFonts w:ascii="Liberation Sans" w:hAnsi="Liberation Sans" w:eastAsia="Noto Sans CJK SC Regular" w:cs="Arial"/>
-                <w:b w:val="false"/>
+                <w:rFonts w:ascii="Arial" w:hAnsi="Arial" w:eastAsia="Noto Sans CJK SC Regular" w:cs="Arial"/>
                 <w:b w:val="false"/>
                 <w:bCs w:val="false"/>
                 <w:color w:val="auto"/>
@@ -681,7 +547,7 @@
             </w:pPr>
             <w:r>
               <w:rPr>
-                <w:rFonts w:eastAsia="Noto Sans CJK SC Regular" w:cs="Arial" w:ascii="Liberation Sans" w:hAnsi="Liberation Sans"/>
+                <w:rFonts w:eastAsia="Noto Sans CJK SC Regular" w:cs="Arial"/>
                 <w:b w:val="false"/>
                 <w:bCs w:val="false"/>
                 <w:color w:val="auto"/>
@@ -699,7 +565,9 @@
       <w:pPr>
         <w:pStyle w:val="Normal"/>
         <w:bidi w:val="0"/>
-        <w:rPr/>
+        <w:rPr>
+          <w:rFonts w:ascii="Arial" w:hAnsi="Arial"/>
+        </w:rPr>
       </w:pPr>
       <w:r>
         <w:rPr/>
@@ -713,10 +581,12 @@
         <w:pStyle w:val="Heading1"/>
         <w:numPr>
           <w:ilvl w:val="0"/>
-          <w:numId w:val="5"/>
+          <w:numId w:val="6"/>
         </w:numPr>
         <w:spacing w:before="0" w:after="720"/>
-        <w:rPr/>
+        <w:rPr>
+          <w:rFonts w:ascii="Arial" w:hAnsi="Arial"/>
+        </w:rPr>
       </w:pPr>
       <w:r>
         <w:rPr/>
@@ -726,7 +596,9 @@
     <w:p>
       <w:pPr>
         <w:pStyle w:val="Normal"/>
-        <w:rPr/>
+        <w:rPr>
+          <w:rFonts w:ascii="Arial" w:hAnsi="Arial"/>
+        </w:rPr>
       </w:pPr>
       <w:r>
         <w:rPr/>
@@ -763,7 +635,9 @@
             <w:pPr>
               <w:pStyle w:val="Normal"/>
               <w:widowControl w:val="false"/>
-              <w:rPr/>
+              <w:rPr>
+                <w:rFonts w:ascii="Arial" w:hAnsi="Arial"/>
+              </w:rPr>
             </w:pPr>
             <w:r>
               <w:rPr/>
@@ -792,7 +666,9 @@
             <w:pPr>
               <w:pStyle w:val="Normal"/>
               <w:widowControl w:val="false"/>
-              <w:rPr/>
+              <w:rPr>
+                <w:rFonts w:ascii="Arial" w:hAnsi="Arial"/>
+              </w:rPr>
             </w:pPr>
             <w:r>
               <w:rPr>
@@ -813,7 +689,9 @@
             <w:pPr>
               <w:pStyle w:val="Normal"/>
               <w:widowControl w:val="false"/>
-              <w:rPr/>
+              <w:rPr>
+                <w:rFonts w:ascii="Arial" w:hAnsi="Arial"/>
+              </w:rPr>
             </w:pPr>
             <w:r>
               <w:rPr>
@@ -844,7 +722,9 @@
             <w:pPr>
               <w:pStyle w:val="Normal"/>
               <w:widowControl w:val="false"/>
-              <w:rPr/>
+              <w:rPr>
+                <w:rFonts w:ascii="Arial" w:hAnsi="Arial"/>
+              </w:rPr>
             </w:pPr>
             <w:r>
               <w:rPr/>
@@ -857,7 +737,9 @@
     <w:p>
       <w:pPr>
         <w:pStyle w:val="Normal"/>
-        <w:rPr/>
+        <w:rPr>
+          <w:rFonts w:ascii="Arial" w:hAnsi="Arial"/>
+        </w:rPr>
       </w:pPr>
       <w:r>
         <w:rPr/>
@@ -868,7 +750,9 @@
       <w:pPr>
         <w:pStyle w:val="Normal"/>
         <w:widowControl w:val="false"/>
-        <w:rPr/>
+        <w:rPr>
+          <w:rFonts w:ascii="Arial" w:hAnsi="Arial"/>
+        </w:rPr>
       </w:pPr>
       <w:r>
         <w:rPr/>
@@ -878,7 +762,9 @@
     <w:p>
       <w:pPr>
         <w:pStyle w:val="Normal"/>
-        <w:rPr/>
+        <w:rPr>
+          <w:rFonts w:ascii="Arial" w:hAnsi="Arial"/>
+        </w:rPr>
       </w:pPr>
       <w:r>
         <w:rPr/>
@@ -888,7 +774,9 @@
     <w:p>
       <w:pPr>
         <w:pStyle w:val="Normal"/>
-        <w:rPr/>
+        <w:rPr>
+          <w:rFonts w:ascii="Arial" w:hAnsi="Arial"/>
+        </w:rPr>
       </w:pPr>
       <w:r>
         <w:rPr/>
@@ -898,7 +786,9 @@
     <w:p>
       <w:pPr>
         <w:pStyle w:val="Normal"/>
-        <w:rPr/>
+        <w:rPr>
+          <w:rFonts w:ascii="Arial" w:hAnsi="Arial"/>
+        </w:rPr>
       </w:pPr>
       <w:r>
         <w:rPr>
@@ -912,9 +802,11 @@
         <w:pStyle w:val="Heading1"/>
         <w:numPr>
           <w:ilvl w:val="0"/>
-          <w:numId w:val="5"/>
+          <w:numId w:val="6"/>
         </w:numPr>
-        <w:rPr/>
+        <w:rPr>
+          <w:rFonts w:ascii="Arial" w:hAnsi="Arial"/>
+        </w:rPr>
       </w:pPr>
       <w:r>
         <w:rPr/>
@@ -924,7 +816,9 @@
     <w:p>
       <w:pPr>
         <w:pStyle w:val="Normal"/>
-        <w:rPr/>
+        <w:rPr>
+          <w:rFonts w:ascii="Arial" w:hAnsi="Arial"/>
+        </w:rPr>
       </w:pPr>
       <w:r>
         <w:rPr/>
@@ -935,7 +829,9 @@
       <w:pPr>
         <w:pStyle w:val="Normal"/>
         <w:widowControl w:val="false"/>
-        <w:rPr/>
+        <w:rPr>
+          <w:rFonts w:ascii="Arial" w:hAnsi="Arial"/>
+        </w:rPr>
       </w:pPr>
       <w:r>
         <w:rPr>
@@ -951,7 +847,9 @@
     <w:p>
       <w:pPr>
         <w:pStyle w:val="Normal"/>
-        <w:rPr/>
+        <w:rPr>
+          <w:rFonts w:ascii="Arial" w:hAnsi="Arial"/>
+        </w:rPr>
       </w:pPr>
       <w:r>
         <w:rPr/>
@@ -974,12 +872,14 @@
         <w:widowControl w:val="false"/>
         <w:numPr>
           <w:ilvl w:val="2"/>
-          <w:numId w:val="4"/>
+          <w:numId w:val="5"/>
         </w:numPr>
         <w:suppressAutoHyphens w:val="true"/>
         <w:spacing w:before="0" w:after="0"/>
-        <w:ind w:left="0" w:right="0" w:hanging="0"/>
-        <w:rPr/>
+        <w:ind w:hanging="0" w:left="0" w:right="0"/>
+        <w:rPr>
+          <w:rFonts w:ascii="Arial" w:hAnsi="Arial"/>
+        </w:rPr>
       </w:pPr>
       <w:r>
         <w:rPr/>
@@ -990,7 +890,9 @@
       <w:pPr>
         <w:pStyle w:val="Normal"/>
         <w:widowControl w:val="false"/>
-        <w:rPr/>
+        <w:rPr>
+          <w:rFonts w:ascii="Arial" w:hAnsi="Arial"/>
+        </w:rPr>
       </w:pPr>
       <w:r>
         <w:rPr/>
@@ -1026,7 +928,9 @@
             <w:pPr>
               <w:pStyle w:val="TableContents"/>
               <w:widowControl w:val="false"/>
-              <w:rPr/>
+              <w:rPr>
+                <w:rFonts w:ascii="Arial" w:hAnsi="Arial"/>
+              </w:rPr>
             </w:pPr>
             <w:r>
               <w:rPr/>
@@ -1042,14 +946,13 @@
               </w:pBdr>
               <w:suppressAutoHyphens w:val="true"/>
               <w:rPr>
-                <w:rFonts w:ascii="Liberation Sans" w:hAnsi="Liberation Sans"/>
+                <w:rFonts w:ascii="Arial" w:hAnsi="Arial"/>
                 <w:sz w:val="18"/>
                 <w:szCs w:val="18"/>
               </w:rPr>
             </w:pPr>
             <w:r>
               <w:rPr>
-                <w:rFonts w:ascii="Liberation Sans" w:hAnsi="Liberation Sans"/>
                 <w:sz w:val="18"/>
                 <w:szCs w:val="18"/>
               </w:rPr>
@@ -1066,7 +969,9 @@
             <w:pPr>
               <w:pStyle w:val="TableContents"/>
               <w:widowControl w:val="false"/>
-              <w:rPr/>
+              <w:rPr>
+                <w:rFonts w:ascii="Arial" w:hAnsi="Arial"/>
+              </w:rPr>
             </w:pPr>
             <w:r>
               <w:rPr/>
@@ -1082,14 +987,13 @@
               </w:pBdr>
               <w:suppressAutoHyphens w:val="true"/>
               <w:rPr>
-                <w:rFonts w:ascii="Liberation Sans" w:hAnsi="Liberation Sans"/>
+                <w:rFonts w:ascii="Arial" w:hAnsi="Arial"/>
                 <w:sz w:val="18"/>
                 <w:szCs w:val="18"/>
               </w:rPr>
             </w:pPr>
             <w:r>
               <w:rPr>
-                <w:rFonts w:ascii="Liberation Sans" w:hAnsi="Liberation Sans"/>
                 <w:sz w:val="18"/>
                 <w:szCs w:val="18"/>
               </w:rPr>
@@ -1101,7 +1005,9 @@
     <w:p>
       <w:pPr>
         <w:pStyle w:val="Normal"/>
-        <w:rPr/>
+        <w:rPr>
+          <w:rFonts w:ascii="Arial" w:hAnsi="Arial"/>
+        </w:rPr>
       </w:pPr>
       <w:r>
         <w:rPr/>
@@ -1110,7 +1016,9 @@
     <w:p>
       <w:pPr>
         <w:pStyle w:val="Normal"/>
-        <w:rPr/>
+        <w:rPr>
+          <w:rFonts w:ascii="Arial" w:hAnsi="Arial"/>
+        </w:rPr>
       </w:pPr>
       <w:r>
         <w:rPr/>
@@ -1120,7 +1028,9 @@
     <w:p>
       <w:pPr>
         <w:pStyle w:val="Normal"/>
-        <w:rPr/>
+        <w:rPr>
+          <w:rFonts w:ascii="Arial" w:hAnsi="Arial"/>
+        </w:rPr>
       </w:pPr>
       <w:r>
         <w:rPr/>
@@ -1130,7 +1040,9 @@
     <w:p>
       <w:pPr>
         <w:pStyle w:val="Normal"/>
-        <w:rPr/>
+        <w:rPr>
+          <w:rFonts w:ascii="Arial" w:hAnsi="Arial"/>
+        </w:rPr>
       </w:pPr>
       <w:r>
         <w:rPr/>
@@ -1140,7 +1052,9 @@
     <w:p>
       <w:pPr>
         <w:pStyle w:val="Normal"/>
-        <w:rPr/>
+        <w:rPr>
+          <w:rFonts w:ascii="Arial" w:hAnsi="Arial"/>
+        </w:rPr>
       </w:pPr>
       <w:r>
         <w:rPr/>
@@ -1150,7 +1064,9 @@
     <w:p>
       <w:pPr>
         <w:pStyle w:val="Normal"/>
-        <w:rPr/>
+        <w:rPr>
+          <w:rFonts w:ascii="Arial" w:hAnsi="Arial"/>
+        </w:rPr>
       </w:pPr>
       <w:r>
         <w:rPr/>
@@ -1160,7 +1076,9 @@
     <w:p>
       <w:pPr>
         <w:pStyle w:val="Normal"/>
-        <w:rPr/>
+        <w:rPr>
+          <w:rFonts w:ascii="Arial" w:hAnsi="Arial"/>
+        </w:rPr>
       </w:pPr>
       <w:r>
         <w:rPr/>
@@ -1175,7 +1093,7 @@
       <w:footerReference w:type="first" r:id="rId7"/>
       <w:type w:val="nextPage"/>
       <w:pgSz w:w="11906" w:h="16838"/>
-      <w:pgMar w:left="1134" w:right="1134" w:gutter="0" w:header="1134" w:top="2603" w:footer="1134" w:bottom="1480"/>
+      <w:pgMar w:left="1134" w:right="1134" w:gutter="0" w:header="1134" w:top="2608" w:footer="1134" w:bottom="1474"/>
       <w:pgNumType w:fmt="decimal"/>
       <w:formProt w:val="false"/>
       <w:textDirection w:val="lrTb"/>
@@ -1206,7 +1124,9 @@
       <w:pStyle w:val="Footer"/>
       <w:bidi w:val="0"/>
       <w:jc w:val="left"/>
-      <w:rPr/>
+      <w:rPr>
+        <w:rFonts w:ascii="Arial" w:hAnsi="Arial"/>
+      </w:rPr>
     </w:pPr>
     <w:r>
       <w:rPr/>
@@ -1222,7 +1142,7 @@
     </w:r>
     <w:r>
       <w:rPr/>
-      <w:t>3</w:t>
+      <w:t>2</w:t>
     </w:r>
     <w:r>
       <w:rPr/>
@@ -1250,7 +1170,7 @@
     </w:r>
     <w:r>
       <w:rPr/>
-      <w:t>3</w:t>
+      <w:t>2</w:t>
     </w:r>
     <w:r>
       <w:rPr/>
@@ -1272,7 +1192,9 @@
       <w:pStyle w:val="Footer"/>
       <w:bidi w:val="0"/>
       <w:jc w:val="left"/>
-      <w:rPr/>
+      <w:rPr>
+        <w:rFonts w:ascii="Arial" w:hAnsi="Arial"/>
+      </w:rPr>
     </w:pPr>
     <w:r>
       <w:rPr/>
@@ -1288,7 +1210,7 @@
     </w:r>
     <w:r>
       <w:rPr/>
-      <w:t>3</w:t>
+      <w:t>2</w:t>
     </w:r>
     <w:r>
       <w:rPr/>
@@ -1316,7 +1238,7 @@
     </w:r>
     <w:r>
       <w:rPr/>
-      <w:t>3</w:t>
+      <w:t>2</w:t>
     </w:r>
     <w:r>
       <w:rPr/>
@@ -1353,12 +1275,14 @@
       <w:suppressLineNumbers/>
       <w:bidi w:val="0"/>
       <w:jc w:val="left"/>
-      <w:rPr/>
+      <w:rPr>
+        <w:rFonts w:ascii="Arial" w:hAnsi="Arial"/>
+      </w:rPr>
     </w:pPr>
     <w:r>
       <w:rPr/>
       <w:drawing>
-        <wp:anchor behindDoc="1" distT="0" distB="0" distL="0" distR="0" simplePos="0" locked="0" layoutInCell="0" allowOverlap="1" relativeHeight="4">
+        <wp:anchor behindDoc="1" distT="0" distB="0" distL="0" distR="0" simplePos="0" locked="0" layoutInCell="0" allowOverlap="1" relativeHeight="3">
           <wp:simplePos x="0" y="0"/>
           <wp:positionH relativeFrom="column">
             <wp:align>left</wp:align>
@@ -1415,12 +1339,14 @@
       <w:suppressLineNumbers/>
       <w:bidi w:val="0"/>
       <w:jc w:val="left"/>
-      <w:rPr/>
+      <w:rPr>
+        <w:rFonts w:ascii="Arial" w:hAnsi="Arial"/>
+      </w:rPr>
     </w:pPr>
     <w:r>
       <w:rPr/>
       <w:drawing>
-        <wp:anchor behindDoc="1" distT="0" distB="0" distL="0" distR="0" simplePos="0" locked="0" layoutInCell="0" allowOverlap="1" relativeHeight="4">
+        <wp:anchor behindDoc="1" distT="0" distB="0" distL="0" distR="0" simplePos="0" locked="0" layoutInCell="0" allowOverlap="1" relativeHeight="3">
           <wp:simplePos x="0" y="0"/>
           <wp:positionH relativeFrom="column">
             <wp:align>left</wp:align>
@@ -1484,7 +1410,6 @@
         </w:tabs>
         <w:ind w:left="0" w:hanging="0"/>
       </w:pPr>
-      <w:rPr/>
     </w:lvl>
     <w:lvl w:ilvl="1">
       <w:start w:val="1"/>
@@ -1498,7 +1423,6 @@
         </w:tabs>
         <w:ind w:left="0" w:hanging="0"/>
       </w:pPr>
-      <w:rPr/>
     </w:lvl>
     <w:lvl w:ilvl="2">
       <w:start w:val="1"/>
@@ -1512,7 +1436,6 @@
         </w:tabs>
         <w:ind w:left="0" w:hanging="0"/>
       </w:pPr>
-      <w:rPr/>
     </w:lvl>
     <w:lvl w:ilvl="3">
       <w:start w:val="1"/>
@@ -1526,7 +1449,6 @@
         </w:tabs>
         <w:ind w:left="0" w:hanging="0"/>
       </w:pPr>
-      <w:rPr/>
     </w:lvl>
     <w:lvl w:ilvl="4">
       <w:start w:val="1"/>
@@ -1540,7 +1462,6 @@
         </w:tabs>
         <w:ind w:left="0" w:hanging="0"/>
       </w:pPr>
-      <w:rPr/>
     </w:lvl>
     <w:lvl w:ilvl="5">
       <w:start w:val="1"/>
@@ -1554,7 +1475,6 @@
         </w:tabs>
         <w:ind w:left="0" w:hanging="0"/>
       </w:pPr>
-      <w:rPr/>
     </w:lvl>
     <w:lvl w:ilvl="6">
       <w:start w:val="1"/>
@@ -1568,7 +1488,6 @@
         </w:tabs>
         <w:ind w:left="0" w:hanging="0"/>
       </w:pPr>
-      <w:rPr/>
     </w:lvl>
     <w:lvl w:ilvl="7">
       <w:start w:val="1"/>
@@ -1582,7 +1501,6 @@
         </w:tabs>
         <w:ind w:left="0" w:hanging="0"/>
       </w:pPr>
-      <w:rPr/>
     </w:lvl>
     <w:lvl w:ilvl="8">
       <w:start w:val="1"/>
@@ -1596,7 +1514,6 @@
         </w:tabs>
         <w:ind w:left="0" w:hanging="0"/>
       </w:pPr>
-      <w:rPr/>
     </w:lvl>
   </w:abstractNum>
   <w:abstractNum w:abstractNumId="2">
@@ -2124,6 +2041,7 @@
         </w:tabs>
         <w:ind w:left="0" w:hanging="0"/>
       </w:pPr>
+      <w:rPr/>
     </w:lvl>
     <w:lvl w:ilvl="1">
       <w:start w:val="1"/>
@@ -2137,6 +2055,7 @@
         </w:tabs>
         <w:ind w:left="0" w:hanging="0"/>
       </w:pPr>
+      <w:rPr/>
     </w:lvl>
     <w:lvl w:ilvl="2">
       <w:start w:val="1"/>
@@ -2150,6 +2069,7 @@
         </w:tabs>
         <w:ind w:left="0" w:hanging="0"/>
       </w:pPr>
+      <w:rPr/>
     </w:lvl>
     <w:lvl w:ilvl="3">
       <w:start w:val="1"/>
@@ -2163,6 +2083,7 @@
         </w:tabs>
         <w:ind w:left="0" w:hanging="0"/>
       </w:pPr>
+      <w:rPr/>
     </w:lvl>
     <w:lvl w:ilvl="4">
       <w:start w:val="1"/>
@@ -2176,6 +2097,7 @@
         </w:tabs>
         <w:ind w:left="0" w:hanging="0"/>
       </w:pPr>
+      <w:rPr/>
     </w:lvl>
     <w:lvl w:ilvl="5">
       <w:start w:val="1"/>
@@ -2189,6 +2111,7 @@
         </w:tabs>
         <w:ind w:left="0" w:hanging="0"/>
       </w:pPr>
+      <w:rPr/>
     </w:lvl>
     <w:lvl w:ilvl="6">
       <w:start w:val="1"/>
@@ -2202,6 +2125,7 @@
         </w:tabs>
         <w:ind w:left="0" w:hanging="0"/>
       </w:pPr>
+      <w:rPr/>
     </w:lvl>
     <w:lvl w:ilvl="7">
       <w:start w:val="1"/>
@@ -2215,6 +2139,7 @@
         </w:tabs>
         <w:ind w:left="0" w:hanging="0"/>
       </w:pPr>
+      <w:rPr/>
     </w:lvl>
     <w:lvl w:ilvl="8">
       <w:start w:val="1"/>
@@ -2228,6 +2153,7 @@
         </w:tabs>
         <w:ind w:left="0" w:hanging="0"/>
       </w:pPr>
+      <w:rPr/>
     </w:lvl>
   </w:abstractNum>
   <w:num w:numId="1">
@@ -2280,7 +2206,7 @@
       <w:jc w:val="left"/>
     </w:pPr>
     <w:rPr>
-      <w:rFonts w:ascii="Frutiger" w:hAnsi="Frutiger" w:eastAsia="Noto Serif CJK SC" w:cs="Lohit Devanagari"/>
+      <w:rFonts w:ascii="Arial" w:hAnsi="Arial" w:eastAsia="Noto Serif CJK SC" w:cs="Lohit Devanagari"/>
       <w:color w:val="auto"/>
       <w:kern w:val="2"/>
       <w:sz w:val="18"/>
@@ -2291,12 +2217,12 @@
   <w:style w:type="paragraph" w:styleId="Heading1">
     <w:name w:val="Heading 1"/>
     <w:basedOn w:val="Heading"/>
-    <w:next w:val="TextBody"/>
+    <w:next w:val="BodyText"/>
     <w:qFormat/>
     <w:pPr>
       <w:numPr>
         <w:ilvl w:val="0"/>
-        <w:numId w:val="3"/>
+        <w:numId w:val="4"/>
       </w:numPr>
       <w:spacing w:before="1440" w:after="720"/>
       <w:outlineLvl w:val="0"/>
@@ -2311,12 +2237,12 @@
   <w:style w:type="paragraph" w:styleId="Heading2">
     <w:name w:val="Heading 2"/>
     <w:basedOn w:val="Heading"/>
-    <w:next w:val="TextBody"/>
+    <w:next w:val="BodyText"/>
     <w:qFormat/>
     <w:pPr>
       <w:numPr>
         <w:ilvl w:val="1"/>
-        <w:numId w:val="1"/>
+        <w:numId w:val="2"/>
       </w:numPr>
       <w:spacing w:before="576" w:after="288"/>
       <w:outlineLvl w:val="1"/>
@@ -2336,11 +2262,11 @@
       <w:widowControl w:val="false"/>
       <w:numPr>
         <w:ilvl w:val="2"/>
-        <w:numId w:val="4"/>
+        <w:numId w:val="5"/>
       </w:numPr>
       <w:suppressAutoHyphens w:val="true"/>
       <w:spacing w:before="0" w:after="0"/>
-      <w:ind w:left="0" w:right="0" w:hanging="0"/>
+      <w:ind w:hanging="0" w:left="0" w:right="0"/>
       <w:outlineLvl w:val="2"/>
     </w:pPr>
     <w:rPr>
@@ -2352,12 +2278,12 @@
   <w:style w:type="paragraph" w:styleId="Heading4">
     <w:name w:val="Heading 4"/>
     <w:basedOn w:val="Heading"/>
-    <w:next w:val="TextBody"/>
+    <w:next w:val="BodyText"/>
     <w:qFormat/>
     <w:pPr>
       <w:numPr>
         <w:ilvl w:val="3"/>
-        <w:numId w:val="2"/>
+        <w:numId w:val="3"/>
       </w:numPr>
       <w:spacing w:before="120" w:after="120"/>
       <w:outlineLvl w:val="3"/>
@@ -2374,20 +2300,20 @@
   <w:style w:type="paragraph" w:styleId="Heading">
     <w:name w:val="Heading"/>
     <w:basedOn w:val="Normal"/>
-    <w:next w:val="TextBody"/>
+    <w:next w:val="BodyText"/>
     <w:qFormat/>
     <w:pPr>
       <w:keepNext w:val="true"/>
       <w:spacing w:before="240" w:after="120"/>
     </w:pPr>
     <w:rPr>
-      <w:rFonts w:ascii="Frutiger" w:hAnsi="Frutiger" w:eastAsia="Noto Sans CJK SC" w:cs="Lohit Devanagari"/>
+      <w:rFonts w:ascii="Arial" w:hAnsi="Arial" w:eastAsia="Noto Sans CJK SC" w:cs="Lohit Devanagari"/>
       <w:b/>
       <w:sz w:val="28"/>
       <w:szCs w:val="28"/>
     </w:rPr>
   </w:style>
-  <w:style w:type="paragraph" w:styleId="TextBody">
+  <w:style w:type="paragraph" w:styleId="BodyText">
     <w:name w:val="Body Text"/>
     <w:basedOn w:val="Normal"/>
     <w:pPr>
@@ -2397,7 +2323,7 @@
   </w:style>
   <w:style w:type="paragraph" w:styleId="List">
     <w:name w:val="List"/>
-    <w:basedOn w:val="TextBody"/>
+    <w:basedOn w:val="BodyText"/>
     <w:pPr/>
     <w:rPr>
       <w:rFonts w:cs="Lohit Devanagari"/>
@@ -2430,28 +2356,12 @@
       <w:rFonts w:cs="Lohit Devanagari"/>
     </w:rPr>
   </w:style>
-  <w:style w:type="paragraph" w:styleId="Caption1">
-    <w:name w:val="caption"/>
-    <w:basedOn w:val="Normal"/>
-    <w:qFormat/>
-    <w:pPr>
-      <w:suppressLineNumbers/>
-      <w:spacing w:before="120" w:after="120"/>
-    </w:pPr>
-    <w:rPr>
-      <w:rFonts w:cs="Lohit Devanagari"/>
-      <w:i/>
-      <w:iCs/>
-      <w:sz w:val="24"/>
-      <w:szCs w:val="24"/>
-    </w:rPr>
-  </w:style>
   <w:style w:type="paragraph" w:styleId="ListContents">
     <w:name w:val="List Contents"/>
     <w:basedOn w:val="Normal"/>
     <w:qFormat/>
     <w:pPr>
-      <w:ind w:left="567" w:hanging="0"/>
+      <w:ind w:hanging="0" w:left="567"/>
     </w:pPr>
     <w:rPr/>
   </w:style>
@@ -2471,12 +2381,12 @@
     <w:qFormat/>
     <w:pPr>
       <w:spacing w:before="0" w:after="283"/>
-      <w:ind w:left="567" w:right="567" w:hanging="0"/>
+      <w:ind w:hanging="0" w:left="567" w:right="567"/>
     </w:pPr>
     <w:rPr/>
   </w:style>
-  <w:style w:type="paragraph" w:styleId="Envelopereturn">
-    <w:name w:val="envelope return"/>
+  <w:style w:type="paragraph" w:styleId="EnvelopeReturn">
+    <w:name w:val="Envelope Return"/>
     <w:basedOn w:val="Normal"/>
     <w:qFormat/>
     <w:pPr>
@@ -2498,14 +2408,14 @@
   <w:style w:type="paragraph" w:styleId="Subtitle">
     <w:name w:val="Subtitle"/>
     <w:basedOn w:val="Heading"/>
-    <w:next w:val="TextBody"/>
+    <w:next w:val="BodyText"/>
     <w:qFormat/>
     <w:pPr>
       <w:spacing w:before="0" w:after="720"/>
       <w:jc w:val="left"/>
     </w:pPr>
     <w:rPr>
-      <w:rFonts w:ascii="Frutiger" w:hAnsi="Frutiger"/>
+      <w:rFonts w:ascii="Arial" w:hAnsi="Arial"/>
       <w:b w:val="false"/>
       <w:color w:val="8A8A8A"/>
       <w:sz w:val="20"/>
@@ -2515,7 +2425,7 @@
   <w:style w:type="paragraph" w:styleId="Title">
     <w:name w:val="Title"/>
     <w:basedOn w:val="Heading"/>
-    <w:next w:val="TextBody"/>
+    <w:next w:val="BodyText"/>
     <w:qFormat/>
     <w:pPr>
       <w:spacing w:before="2160" w:after="288"/>
@@ -2585,6 +2495,71 @@
     <w:qFormat/>
     <w:pPr/>
     <w:rPr/>
+  </w:style>
+  <w:style w:type="paragraph" w:styleId="EnvelopeAddress">
+    <w:name w:val="Envelope Address"/>
+    <w:basedOn w:val="Normal"/>
+    <w:pPr>
+      <w:suppressLineNumbers/>
+      <w:spacing w:before="0" w:after="60"/>
+    </w:pPr>
+    <w:rPr/>
+  </w:style>
+  <w:style w:type="paragraph" w:styleId="FootnoteText">
+    <w:name w:val="Footnote Text"/>
+    <w:basedOn w:val="Normal"/>
+    <w:pPr>
+      <w:suppressLineNumbers/>
+      <w:ind w:hanging="340" w:left="340"/>
+    </w:pPr>
+    <w:rPr>
+      <w:sz w:val="20"/>
+      <w:szCs w:val="20"/>
+    </w:rPr>
+  </w:style>
+  <w:style w:type="paragraph" w:styleId="EndnoteText">
+    <w:name w:val="Endnote Text"/>
+    <w:basedOn w:val="Normal"/>
+    <w:pPr>
+      <w:suppressLineNumbers/>
+      <w:ind w:hanging="340" w:left="340"/>
+    </w:pPr>
+    <w:rPr>
+      <w:sz w:val="20"/>
+      <w:szCs w:val="20"/>
+    </w:rPr>
+  </w:style>
+  <w:style w:type="paragraph" w:styleId="Salutation">
+    <w:name w:val="Salutation"/>
+    <w:basedOn w:val="Normal"/>
+    <w:pPr>
+      <w:suppressLineNumbers/>
+    </w:pPr>
+    <w:rPr/>
+  </w:style>
+  <w:style w:type="paragraph" w:styleId="Comment">
+    <w:name w:val="Comment"/>
+    <w:basedOn w:val="Normal"/>
+    <w:qFormat/>
+    <w:pPr/>
+    <w:rPr>
+      <w:sz w:val="20"/>
+      <w:szCs w:val="20"/>
+    </w:rPr>
+  </w:style>
+  <w:style w:type="paragraph" w:styleId="Closing">
+    <w:name w:val="Closing"/>
+    <w:basedOn w:val="Heading"/>
+    <w:next w:val="BodyText"/>
+    <w:pPr>
+      <w:jc w:val="center"/>
+    </w:pPr>
+    <w:rPr>
+      <w:b/>
+      <w:bCs/>
+      <w:sz w:val="32"/>
+      <w:szCs w:val="32"/>
+    </w:rPr>
   </w:style>
 </w:styles>
 </file>

</xml_diff>